<commit_message>
Finished Haskell Types description
</commit_message>
<xml_diff>
--- a/Fase 2/Tipos de datos y tipado en Haskell.docx
+++ b/Fase 2/Tipos de datos y tipado en Haskell.docx
@@ -32,18 +32,8 @@
           <w:bCs/>
           <w:u w:val="single"/>
         </w:rPr>
-        <w:t xml:space="preserve">Tipado </w:t>
-      </w:r>
-      <w:proofErr w:type="spellStart"/>
-      <w:r>
-        <w:rPr>
-          <w:b/>
-          <w:bCs/>
-          <w:u w:val="single"/>
-        </w:rPr>
-        <w:t>est</w:t>
-      </w:r>
-      <w:proofErr w:type="spellEnd"/>
+        <w:t>Tipado est</w:t>
+      </w:r>
       <w:r>
         <w:rPr>
           <w:b/>
@@ -101,15 +91,13 @@
         </w:rPr>
         <w:t xml:space="preserve">Tabla 1: </w:t>
       </w:r>
-      <w:proofErr w:type="spellStart"/>
       <w:r>
         <w:rPr>
           <w:i/>
           <w:iCs/>
         </w:rPr>
-        <w:t>Caracteristicas</w:t>
-      </w:r>
-      <w:proofErr w:type="spellEnd"/>
+        <w:t>Características</w:t>
+      </w:r>
       <w:r>
         <w:rPr>
           <w:i/>
@@ -125,6 +113,390 @@
         <w:t>Haskell vs. Python vs. Java.</w:t>
       </w:r>
     </w:p>
+    <w:tbl>
+      <w:tblPr>
+        <w:tblStyle w:val="TableGrid"/>
+        <w:tblW w:w="0" w:type="auto"/>
+        <w:tblLook w:val="04A0" w:firstRow="1" w:lastRow="0" w:firstColumn="1" w:lastColumn="0" w:noHBand="0" w:noVBand="1"/>
+      </w:tblPr>
+      <w:tblGrid>
+        <w:gridCol w:w="2337"/>
+        <w:gridCol w:w="2337"/>
+        <w:gridCol w:w="2338"/>
+        <w:gridCol w:w="2338"/>
+      </w:tblGrid>
+      <w:tr>
+        <w:tc>
+          <w:tcPr>
+            <w:tcW w:w="2337" w:type="dxa"/>
+          </w:tcPr>
+          <w:p>
+            <w:pPr>
+              <w:rPr>
+                <w:b/>
+                <w:bCs/>
+                <w:u w:val="single"/>
+                <w:lang w:val="es-419"/>
+              </w:rPr>
+            </w:pPr>
+            <w:r>
+              <w:rPr>
+                <w:b/>
+                <w:bCs/>
+                <w:u w:val="single"/>
+              </w:rPr>
+              <w:t>Caracte</w:t>
+            </w:r>
+            <w:r>
+              <w:rPr>
+                <w:b/>
+                <w:bCs/>
+                <w:u w:val="single"/>
+              </w:rPr>
+              <w:t>r</w:t>
+            </w:r>
+            <w:r>
+              <w:rPr>
+                <w:b/>
+                <w:bCs/>
+                <w:u w:val="single"/>
+                <w:lang w:val="es-419"/>
+              </w:rPr>
+              <w:t>ística</w:t>
+            </w:r>
+          </w:p>
+        </w:tc>
+        <w:tc>
+          <w:tcPr>
+            <w:tcW w:w="2337" w:type="dxa"/>
+          </w:tcPr>
+          <w:p>
+            <w:pPr>
+              <w:rPr>
+                <w:b/>
+                <w:bCs/>
+                <w:u w:val="single"/>
+              </w:rPr>
+            </w:pPr>
+            <w:r>
+              <w:rPr>
+                <w:b/>
+                <w:bCs/>
+                <w:u w:val="single"/>
+              </w:rPr>
+              <w:t>Haskell</w:t>
+            </w:r>
+          </w:p>
+        </w:tc>
+        <w:tc>
+          <w:tcPr>
+            <w:tcW w:w="2338" w:type="dxa"/>
+          </w:tcPr>
+          <w:p>
+            <w:pPr>
+              <w:rPr>
+                <w:b/>
+                <w:bCs/>
+                <w:u w:val="single"/>
+              </w:rPr>
+            </w:pPr>
+            <w:r>
+              <w:rPr>
+                <w:b/>
+                <w:bCs/>
+                <w:u w:val="single"/>
+              </w:rPr>
+              <w:t>Python</w:t>
+            </w:r>
+          </w:p>
+        </w:tc>
+        <w:tc>
+          <w:tcPr>
+            <w:tcW w:w="2338" w:type="dxa"/>
+          </w:tcPr>
+          <w:p>
+            <w:pPr>
+              <w:rPr>
+                <w:b/>
+                <w:bCs/>
+                <w:u w:val="single"/>
+              </w:rPr>
+            </w:pPr>
+            <w:r>
+              <w:rPr>
+                <w:b/>
+                <w:bCs/>
+                <w:u w:val="single"/>
+              </w:rPr>
+              <w:t>Java</w:t>
+            </w:r>
+          </w:p>
+        </w:tc>
+      </w:tr>
+      <w:tr>
+        <w:tc>
+          <w:tcPr>
+            <w:tcW w:w="2337" w:type="dxa"/>
+          </w:tcPr>
+          <w:p>
+            <w:pPr>
+              <w:rPr>
+                <w:b/>
+                <w:bCs/>
+              </w:rPr>
+            </w:pPr>
+            <w:r>
+              <w:rPr>
+                <w:b/>
+                <w:bCs/>
+              </w:rPr>
+              <w:t>Tipado</w:t>
+            </w:r>
+          </w:p>
+        </w:tc>
+        <w:tc>
+          <w:tcPr>
+            <w:tcW w:w="2337" w:type="dxa"/>
+          </w:tcPr>
+          <w:p>
+            <w:r>
+              <w:t>Estático</w:t>
+            </w:r>
+          </w:p>
+        </w:tc>
+        <w:tc>
+          <w:tcPr>
+            <w:tcW w:w="2338" w:type="dxa"/>
+          </w:tcPr>
+          <w:p>
+            <w:r>
+              <w:t>Dinámico</w:t>
+            </w:r>
+          </w:p>
+        </w:tc>
+        <w:tc>
+          <w:tcPr>
+            <w:tcW w:w="2338" w:type="dxa"/>
+          </w:tcPr>
+          <w:p>
+            <w:r>
+              <w:t>Estático</w:t>
+            </w:r>
+          </w:p>
+        </w:tc>
+      </w:tr>
+      <w:tr>
+        <w:tc>
+          <w:tcPr>
+            <w:tcW w:w="2337" w:type="dxa"/>
+          </w:tcPr>
+          <w:p>
+            <w:pPr>
+              <w:rPr>
+                <w:b/>
+                <w:bCs/>
+              </w:rPr>
+            </w:pPr>
+            <w:r>
+              <w:rPr>
+                <w:b/>
+                <w:bCs/>
+              </w:rPr>
+              <w:t>Fortaleza del tipo</w:t>
+            </w:r>
+          </w:p>
+        </w:tc>
+        <w:tc>
+          <w:tcPr>
+            <w:tcW w:w="2337" w:type="dxa"/>
+          </w:tcPr>
+          <w:p>
+            <w:r>
+              <w:t>Muy fuerte</w:t>
+            </w:r>
+          </w:p>
+        </w:tc>
+        <w:tc>
+          <w:tcPr>
+            <w:tcW w:w="2338" w:type="dxa"/>
+          </w:tcPr>
+          <w:p>
+            <w:r>
+              <w:t>Fuerte</w:t>
+            </w:r>
+          </w:p>
+        </w:tc>
+        <w:tc>
+          <w:tcPr>
+            <w:tcW w:w="2338" w:type="dxa"/>
+          </w:tcPr>
+          <w:p>
+            <w:r>
+              <w:t>Fuerte</w:t>
+            </w:r>
+          </w:p>
+        </w:tc>
+      </w:tr>
+      <w:tr>
+        <w:tc>
+          <w:tcPr>
+            <w:tcW w:w="2337" w:type="dxa"/>
+          </w:tcPr>
+          <w:p>
+            <w:pPr>
+              <w:rPr>
+                <w:b/>
+                <w:bCs/>
+              </w:rPr>
+            </w:pPr>
+            <w:r>
+              <w:rPr>
+                <w:b/>
+                <w:bCs/>
+              </w:rPr>
+              <w:t>Inferencia de tipos</w:t>
+            </w:r>
+          </w:p>
+        </w:tc>
+        <w:tc>
+          <w:tcPr>
+            <w:tcW w:w="2337" w:type="dxa"/>
+          </w:tcPr>
+          <w:p>
+            <w:r>
+              <w:t>Total (Mediante Hindley-Milner)</w:t>
+            </w:r>
+          </w:p>
+        </w:tc>
+        <w:tc>
+          <w:tcPr>
+            <w:tcW w:w="2338" w:type="dxa"/>
+          </w:tcPr>
+          <w:p>
+            <w:r>
+              <w:t>No nativa</w:t>
+            </w:r>
+          </w:p>
+        </w:tc>
+        <w:tc>
+          <w:tcPr>
+            <w:tcW w:w="2338" w:type="dxa"/>
+          </w:tcPr>
+          <w:p>
+            <w:r>
+              <w:t>Parcial (Java 10 y posteriores)</w:t>
+            </w:r>
+          </w:p>
+        </w:tc>
+      </w:tr>
+      <w:tr>
+        <w:tc>
+          <w:tcPr>
+            <w:tcW w:w="2337" w:type="dxa"/>
+          </w:tcPr>
+          <w:p>
+            <w:pPr>
+              <w:rPr>
+                <w:b/>
+                <w:bCs/>
+              </w:rPr>
+            </w:pPr>
+            <w:r>
+              <w:rPr>
+                <w:b/>
+                <w:bCs/>
+              </w:rPr>
+              <w:t>Polimorfismo</w:t>
+            </w:r>
+          </w:p>
+        </w:tc>
+        <w:tc>
+          <w:tcPr>
+            <w:tcW w:w="2337" w:type="dxa"/>
+          </w:tcPr>
+          <w:p>
+            <w:r>
+              <w:t>Paramétrico y de clase de tipos</w:t>
+            </w:r>
+          </w:p>
+        </w:tc>
+        <w:tc>
+          <w:tcPr>
+            <w:tcW w:w="2338" w:type="dxa"/>
+          </w:tcPr>
+          <w:p>
+            <w:r>
+              <w:t>Duck typing</w:t>
+            </w:r>
+            <w:r>
+              <w:t xml:space="preserve"> (determinado por métodos y atributos, no clase o tipo)</w:t>
+            </w:r>
+          </w:p>
+        </w:tc>
+        <w:tc>
+          <w:tcPr>
+            <w:tcW w:w="2338" w:type="dxa"/>
+          </w:tcPr>
+          <w:p>
+            <w:r>
+              <w:t>Genéricos y OOP</w:t>
+            </w:r>
+          </w:p>
+        </w:tc>
+      </w:tr>
+      <w:tr>
+        <w:tc>
+          <w:tcPr>
+            <w:tcW w:w="2337" w:type="dxa"/>
+          </w:tcPr>
+          <w:p>
+            <w:pPr>
+              <w:rPr>
+                <w:b/>
+                <w:bCs/>
+              </w:rPr>
+            </w:pPr>
+            <w:r>
+              <w:rPr>
+                <w:b/>
+                <w:bCs/>
+              </w:rPr>
+              <w:t>Null safety</w:t>
+            </w:r>
+          </w:p>
+        </w:tc>
+        <w:tc>
+          <w:tcPr>
+            <w:tcW w:w="2337" w:type="dxa"/>
+          </w:tcPr>
+          <w:p>
+            <w:r>
+              <w:t>Maybe-Either (seguro)</w:t>
+            </w:r>
+          </w:p>
+        </w:tc>
+        <w:tc>
+          <w:tcPr>
+            <w:tcW w:w="2338" w:type="dxa"/>
+          </w:tcPr>
+          <w:p>
+            <w:r>
+              <w:t>None (inseguro)</w:t>
+            </w:r>
+          </w:p>
+        </w:tc>
+        <w:tc>
+          <w:tcPr>
+            <w:tcW w:w="2338" w:type="dxa"/>
+          </w:tcPr>
+          <w:p>
+            <w:r>
+              <w:t>Null (inseguro)</w:t>
+            </w:r>
+          </w:p>
+        </w:tc>
+      </w:tr>
+    </w:tbl>
     <w:p/>
     <w:p>
       <w:r>
@@ -177,46 +549,497 @@
         <w:t>Tipos de datos primitivos en Haskell</w:t>
       </w:r>
     </w:p>
+    <w:p>
+      <w:pPr>
+        <w:jc w:val="center"/>
+        <w:rPr>
+          <w:i/>
+          <w:iCs/>
+        </w:rPr>
+      </w:pPr>
+      <w:r>
+        <w:rPr>
+          <w:i/>
+          <w:iCs/>
+        </w:rPr>
+        <w:t>Tabla 2: Comparación</w:t>
+      </w:r>
+      <w:r>
+        <w:rPr>
+          <w:i/>
+          <w:iCs/>
+        </w:rPr>
+        <w:t xml:space="preserve"> datos primitivos de Haskell, Java y Python.</w:t>
+      </w:r>
+    </w:p>
+    <w:tbl>
+      <w:tblPr>
+        <w:tblStyle w:val="TableGrid"/>
+        <w:tblW w:w="0" w:type="auto"/>
+        <w:tblLook w:val="04A0" w:firstRow="1" w:lastRow="0" w:firstColumn="1" w:lastColumn="0" w:noHBand="0" w:noVBand="1"/>
+      </w:tblPr>
+      <w:tblGrid>
+        <w:gridCol w:w="2337"/>
+        <w:gridCol w:w="2337"/>
+        <w:gridCol w:w="2338"/>
+        <w:gridCol w:w="2338"/>
+      </w:tblGrid>
+      <w:tr>
+        <w:tc>
+          <w:tcPr>
+            <w:tcW w:w="2337" w:type="dxa"/>
+          </w:tcPr>
+          <w:p>
+            <w:pPr>
+              <w:rPr>
+                <w:b/>
+                <w:bCs/>
+              </w:rPr>
+            </w:pPr>
+            <w:r>
+              <w:rPr>
+                <w:b/>
+                <w:bCs/>
+              </w:rPr>
+              <w:t>Tipo Haskell</w:t>
+            </w:r>
+          </w:p>
+        </w:tc>
+        <w:tc>
+          <w:tcPr>
+            <w:tcW w:w="2337" w:type="dxa"/>
+          </w:tcPr>
+          <w:p>
+            <w:pPr>
+              <w:rPr>
+                <w:b/>
+                <w:bCs/>
+              </w:rPr>
+            </w:pPr>
+            <w:r>
+              <w:rPr>
+                <w:b/>
+                <w:bCs/>
+              </w:rPr>
+              <w:t>Descripción</w:t>
+            </w:r>
+          </w:p>
+        </w:tc>
+        <w:tc>
+          <w:tcPr>
+            <w:tcW w:w="2338" w:type="dxa"/>
+          </w:tcPr>
+          <w:p>
+            <w:pPr>
+              <w:rPr>
+                <w:b/>
+                <w:bCs/>
+              </w:rPr>
+            </w:pPr>
+            <w:r>
+              <w:rPr>
+                <w:b/>
+                <w:bCs/>
+              </w:rPr>
+              <w:t>Equivalente Java</w:t>
+            </w:r>
+          </w:p>
+        </w:tc>
+        <w:tc>
+          <w:tcPr>
+            <w:tcW w:w="2338" w:type="dxa"/>
+          </w:tcPr>
+          <w:p>
+            <w:pPr>
+              <w:rPr>
+                <w:b/>
+                <w:bCs/>
+              </w:rPr>
+            </w:pPr>
+            <w:r>
+              <w:rPr>
+                <w:b/>
+                <w:bCs/>
+              </w:rPr>
+              <w:t>Equivalente Python</w:t>
+            </w:r>
+          </w:p>
+        </w:tc>
+      </w:tr>
+      <w:tr>
+        <w:tc>
+          <w:tcPr>
+            <w:tcW w:w="2337" w:type="dxa"/>
+          </w:tcPr>
+          <w:p>
+            <w:r>
+              <w:lastRenderedPageBreak/>
+              <w:t>Int</w:t>
+            </w:r>
+          </w:p>
+        </w:tc>
+        <w:tc>
+          <w:tcPr>
+            <w:tcW w:w="2337" w:type="dxa"/>
+          </w:tcPr>
+          <w:p>
+            <w:r>
+              <w:t>Entero de precisión fija</w:t>
+            </w:r>
+          </w:p>
+        </w:tc>
+        <w:tc>
+          <w:tcPr>
+            <w:tcW w:w="2338" w:type="dxa"/>
+          </w:tcPr>
+          <w:p>
+            <w:r>
+              <w:t>i</w:t>
+            </w:r>
+            <w:r>
+              <w:t>nt / long</w:t>
+            </w:r>
+          </w:p>
+        </w:tc>
+        <w:tc>
+          <w:tcPr>
+            <w:tcW w:w="2338" w:type="dxa"/>
+          </w:tcPr>
+          <w:p>
+            <w:r>
+              <w:t>Int</w:t>
+            </w:r>
+          </w:p>
+        </w:tc>
+      </w:tr>
+      <w:tr>
+        <w:tc>
+          <w:tcPr>
+            <w:tcW w:w="2337" w:type="dxa"/>
+          </w:tcPr>
+          <w:p>
+            <w:r>
+              <w:t>Integer</w:t>
+            </w:r>
+          </w:p>
+        </w:tc>
+        <w:tc>
+          <w:tcPr>
+            <w:tcW w:w="2337" w:type="dxa"/>
+          </w:tcPr>
+          <w:p>
+            <w:r>
+              <w:t>Entero de precisión arbitraria</w:t>
+            </w:r>
+          </w:p>
+        </w:tc>
+        <w:tc>
+          <w:tcPr>
+            <w:tcW w:w="2338" w:type="dxa"/>
+          </w:tcPr>
+          <w:p>
+            <w:r>
+              <w:t>BigInteger</w:t>
+            </w:r>
+          </w:p>
+        </w:tc>
+        <w:tc>
+          <w:tcPr>
+            <w:tcW w:w="2338" w:type="dxa"/>
+          </w:tcPr>
+          <w:p>
+            <w:r>
+              <w:t>int</w:t>
+            </w:r>
+          </w:p>
+        </w:tc>
+      </w:tr>
+      <w:tr>
+        <w:tc>
+          <w:tcPr>
+            <w:tcW w:w="2337" w:type="dxa"/>
+          </w:tcPr>
+          <w:p>
+            <w:r>
+              <w:t>Float</w:t>
+            </w:r>
+          </w:p>
+        </w:tc>
+        <w:tc>
+          <w:tcPr>
+            <w:tcW w:w="2337" w:type="dxa"/>
+          </w:tcPr>
+          <w:p>
+            <w:r>
+              <w:t>Punto flotante simple</w:t>
+            </w:r>
+          </w:p>
+        </w:tc>
+        <w:tc>
+          <w:tcPr>
+            <w:tcW w:w="2338" w:type="dxa"/>
+          </w:tcPr>
+          <w:p>
+            <w:r>
+              <w:t>float</w:t>
+            </w:r>
+          </w:p>
+        </w:tc>
+        <w:tc>
+          <w:tcPr>
+            <w:tcW w:w="2338" w:type="dxa"/>
+          </w:tcPr>
+          <w:p>
+            <w:r>
+              <w:t>---</w:t>
+            </w:r>
+          </w:p>
+        </w:tc>
+      </w:tr>
+      <w:tr>
+        <w:tc>
+          <w:tcPr>
+            <w:tcW w:w="2337" w:type="dxa"/>
+          </w:tcPr>
+          <w:p>
+            <w:r>
+              <w:t>Double</w:t>
+            </w:r>
+          </w:p>
+        </w:tc>
+        <w:tc>
+          <w:tcPr>
+            <w:tcW w:w="2337" w:type="dxa"/>
+          </w:tcPr>
+          <w:p>
+            <w:r>
+              <w:t>Punto flotante doble</w:t>
+            </w:r>
+          </w:p>
+        </w:tc>
+        <w:tc>
+          <w:tcPr>
+            <w:tcW w:w="2338" w:type="dxa"/>
+          </w:tcPr>
+          <w:p>
+            <w:r>
+              <w:t>double</w:t>
+            </w:r>
+          </w:p>
+        </w:tc>
+        <w:tc>
+          <w:tcPr>
+            <w:tcW w:w="2338" w:type="dxa"/>
+          </w:tcPr>
+          <w:p>
+            <w:r>
+              <w:t>f</w:t>
+            </w:r>
+            <w:r>
+              <w:t>loat</w:t>
+            </w:r>
+          </w:p>
+        </w:tc>
+      </w:tr>
+      <w:tr>
+        <w:tc>
+          <w:tcPr>
+            <w:tcW w:w="2337" w:type="dxa"/>
+          </w:tcPr>
+          <w:p>
+            <w:r>
+              <w:t>Char</w:t>
+            </w:r>
+          </w:p>
+        </w:tc>
+        <w:tc>
+          <w:tcPr>
+            <w:tcW w:w="2337" w:type="dxa"/>
+          </w:tcPr>
+          <w:p>
+            <w:r>
+              <w:t>Carácter Unicode</w:t>
+            </w:r>
+          </w:p>
+        </w:tc>
+        <w:tc>
+          <w:tcPr>
+            <w:tcW w:w="2338" w:type="dxa"/>
+          </w:tcPr>
+          <w:p>
+            <w:r>
+              <w:t>char</w:t>
+            </w:r>
+          </w:p>
+        </w:tc>
+        <w:tc>
+          <w:tcPr>
+            <w:tcW w:w="2338" w:type="dxa"/>
+          </w:tcPr>
+          <w:p>
+            <w:r>
+              <w:t>s</w:t>
+            </w:r>
+            <w:r>
+              <w:t>Str (longitud 1)</w:t>
+            </w:r>
+          </w:p>
+        </w:tc>
+      </w:tr>
+      <w:tr>
+        <w:tc>
+          <w:tcPr>
+            <w:tcW w:w="2337" w:type="dxa"/>
+          </w:tcPr>
+          <w:p>
+            <w:r>
+              <w:t>Bool</w:t>
+            </w:r>
+          </w:p>
+        </w:tc>
+        <w:tc>
+          <w:tcPr>
+            <w:tcW w:w="2337" w:type="dxa"/>
+          </w:tcPr>
+          <w:p>
+            <w:r>
+              <w:t>True o False</w:t>
+            </w:r>
+          </w:p>
+        </w:tc>
+        <w:tc>
+          <w:tcPr>
+            <w:tcW w:w="2338" w:type="dxa"/>
+          </w:tcPr>
+          <w:p>
+            <w:r>
+              <w:t>boolean</w:t>
+            </w:r>
+          </w:p>
+        </w:tc>
+        <w:tc>
+          <w:tcPr>
+            <w:tcW w:w="2338" w:type="dxa"/>
+          </w:tcPr>
+          <w:p>
+            <w:r>
+              <w:t>b</w:t>
+            </w:r>
+            <w:r>
+              <w:t>ool</w:t>
+            </w:r>
+          </w:p>
+        </w:tc>
+      </w:tr>
+      <w:tr>
+        <w:tc>
+          <w:tcPr>
+            <w:tcW w:w="2337" w:type="dxa"/>
+          </w:tcPr>
+          <w:p>
+            <w:r>
+              <w:t>String</w:t>
+            </w:r>
+          </w:p>
+        </w:tc>
+        <w:tc>
+          <w:tcPr>
+            <w:tcW w:w="2337" w:type="dxa"/>
+          </w:tcPr>
+          <w:p>
+            <w:r>
+              <w:t>Lista de Char (caracteres)</w:t>
+            </w:r>
+          </w:p>
+        </w:tc>
+        <w:tc>
+          <w:tcPr>
+            <w:tcW w:w="2338" w:type="dxa"/>
+          </w:tcPr>
+          <w:p>
+            <w:r>
+              <w:t>String</w:t>
+            </w:r>
+          </w:p>
+        </w:tc>
+        <w:tc>
+          <w:tcPr>
+            <w:tcW w:w="2338" w:type="dxa"/>
+          </w:tcPr>
+          <w:p>
+            <w:r>
+              <w:t>s</w:t>
+            </w:r>
+            <w:r>
+              <w:t>tr</w:t>
+            </w:r>
+          </w:p>
+        </w:tc>
+      </w:tr>
+      <w:tr>
+        <w:tc>
+          <w:tcPr>
+            <w:tcW w:w="2337" w:type="dxa"/>
+          </w:tcPr>
+          <w:p>
+            <w:r>
+              <w:t>()</w:t>
+            </w:r>
+          </w:p>
+        </w:tc>
+        <w:tc>
+          <w:tcPr>
+            <w:tcW w:w="2337" w:type="dxa"/>
+          </w:tcPr>
+          <w:p>
+            <w:r>
+              <w:t>Tipo unit (</w:t>
+            </w:r>
+            <w:r>
+              <w:t>un solo valor</w:t>
+            </w:r>
+            <w:r>
+              <w:t>)</w:t>
+            </w:r>
+          </w:p>
+        </w:tc>
+        <w:tc>
+          <w:tcPr>
+            <w:tcW w:w="2338" w:type="dxa"/>
+          </w:tcPr>
+          <w:p>
+            <w:r>
+              <w:t>void</w:t>
+            </w:r>
+          </w:p>
+        </w:tc>
+        <w:tc>
+          <w:tcPr>
+            <w:tcW w:w="2338" w:type="dxa"/>
+          </w:tcPr>
+          <w:p>
+            <w:r>
+              <w:t>None</w:t>
+            </w:r>
+          </w:p>
+        </w:tc>
+      </w:tr>
+    </w:tbl>
     <w:p/>
-    <w:p/>
     <w:p>
       <w:pPr>
         <w:jc w:val="both"/>
       </w:pPr>
       <w:r>
-        <w:t xml:space="preserve">Una diferencia notable es </w:t>
-      </w:r>
-      <w:proofErr w:type="gramStart"/>
-      <w:r>
-        <w:t>que</w:t>
-      </w:r>
-      <w:proofErr w:type="gramEnd"/>
-      <w:r>
-        <w:t xml:space="preserve"> en Haskell, los literales numéricos son polimórficos. Por ejemplo, el literal 42 puede ser de tipo </w:t>
-      </w:r>
-      <w:proofErr w:type="spellStart"/>
-      <w:r>
-        <w:t>Int</w:t>
-      </w:r>
-      <w:proofErr w:type="spellEnd"/>
-      <w:r>
-        <w:t xml:space="preserve">, </w:t>
-      </w:r>
-      <w:proofErr w:type="spellStart"/>
-      <w:r>
-        <w:t>Integer</w:t>
-      </w:r>
-      <w:proofErr w:type="spellEnd"/>
-      <w:r>
-        <w:t xml:space="preserve">, </w:t>
-      </w:r>
-      <w:proofErr w:type="spellStart"/>
-      <w:r>
-        <w:t>Float</w:t>
-      </w:r>
-      <w:proofErr w:type="spellEnd"/>
-      <w:r>
-        <w:t xml:space="preserve">, Double, etc., dependiendo del contexto. </w:t>
+        <w:t xml:space="preserve">Una diferencia notable es que en Haskell, los literales numéricos son polimórficos. Por ejemplo, el literal 42 puede ser de tipo Int, Integer, Float, Double, etc., dependiendo del contexto. </w:t>
+      </w:r>
+    </w:p>
+    <w:p>
+      <w:pPr>
+        <w:jc w:val="both"/>
+      </w:pPr>
+      <w:r>
+        <w:t>(Lipovaca, 2011)</w:t>
       </w:r>
     </w:p>
     <w:p>
@@ -266,7 +1089,6 @@
           <w:b/>
           <w:bCs/>
         </w:rPr>
-        <w:lastRenderedPageBreak/>
         <w:t>Tuplas</w:t>
       </w:r>
     </w:p>
@@ -275,29 +1097,13 @@
         <w:jc w:val="both"/>
       </w:pPr>
       <w:r>
-        <w:t xml:space="preserve">Las tuplas en Haskell agrupan un número fijo de elementos que pueden ser de tipos distintos. Son análogas a los </w:t>
-      </w:r>
-      <w:proofErr w:type="spellStart"/>
-      <w:r>
-        <w:t>records</w:t>
-      </w:r>
-      <w:proofErr w:type="spellEnd"/>
-      <w:r>
-        <w:t xml:space="preserve"> inmutables o a las data </w:t>
-      </w:r>
-      <w:proofErr w:type="spellStart"/>
-      <w:r>
-        <w:t>clas</w:t>
+        <w:t>Las tuplas en Haskell agrupan un número fijo de elementos que pueden ser de tipos distintos. Son análogas a los records inmutables o a las data clas</w:t>
       </w:r>
       <w:r>
         <w:t>s</w:t>
       </w:r>
       <w:r>
-        <w:t>es</w:t>
-      </w:r>
-      <w:proofErr w:type="spellEnd"/>
-      <w:r>
-        <w:t>. En Python existen las tuplas como tipo nativo; en Java no existe un equivalente directo nativo</w:t>
+        <w:t>es. En Python existen las tuplas como tipo nativo; en Java no existe un equivalente directo nativo</w:t>
       </w:r>
       <w:r>
         <w:t xml:space="preserve">. </w:t>
@@ -320,39 +1126,7 @@
         <w:jc w:val="both"/>
       </w:pPr>
       <w:r>
-        <w:t xml:space="preserve">Haskell elimina el concepto de </w:t>
-      </w:r>
-      <w:proofErr w:type="spellStart"/>
-      <w:r>
-        <w:t>null</w:t>
-      </w:r>
-      <w:proofErr w:type="spellEnd"/>
-      <w:r>
-        <w:t xml:space="preserve"> mediante el tipo Maybe, que puede ser Just a (contiene un valor) o </w:t>
-      </w:r>
-      <w:proofErr w:type="spellStart"/>
-      <w:r>
-        <w:t>Nothing</w:t>
-      </w:r>
-      <w:proofErr w:type="spellEnd"/>
-      <w:r>
-        <w:t xml:space="preserve"> (ausencia de valor). Esto obliga al programador a manejar explícitamente la ausencia de valor, previniendo errores en tiempo de ejecución como </w:t>
-      </w:r>
-      <w:proofErr w:type="spellStart"/>
-      <w:r>
-        <w:t>NullPointerException</w:t>
-      </w:r>
-      <w:proofErr w:type="spellEnd"/>
-      <w:r>
-        <w:t xml:space="preserve"> en Java o </w:t>
-      </w:r>
-      <w:proofErr w:type="spellStart"/>
-      <w:r>
-        <w:t>AttributeError</w:t>
-      </w:r>
-      <w:proofErr w:type="spellEnd"/>
-      <w:r>
-        <w:t xml:space="preserve"> en Python.</w:t>
+        <w:t>Haskell elimina el concepto de null mediante el tipo Maybe, que puede ser Just a (contiene un valor) o Nothing (ausencia de valor). Esto obliga al programador a manejar explícitamente la ausencia de valor, previniendo errores en tiempo de ejecución como NullPointerException en Java o AttributeError en Python.</w:t>
       </w:r>
     </w:p>
     <w:p>
@@ -384,15 +1158,8 @@
         <w:jc w:val="both"/>
       </w:pPr>
       <w:r>
-        <w:t>Una de las características más poderosas de Haskell es el soporte para Tipos de Datos Algebraicos. Permiten definir tipos que pueden tener múltiples constructores, equivalente a los en</w:t>
-      </w:r>
-      <w:proofErr w:type="spellStart"/>
-      <w:r>
-        <w:t>ums</w:t>
-      </w:r>
-      <w:proofErr w:type="spellEnd"/>
-      <w:r>
-        <w:t xml:space="preserve"> de Java o a la simulación con clases.</w:t>
+        <w:lastRenderedPageBreak/>
+        <w:t>Una de las características más poderosas de Haskell es el soporte para Tipos de Datos Algebraicos. Permiten definir tipos que pueden tener múltiples constructores, equivalente a los enums de Java o a la simulación con clases.</w:t>
       </w:r>
     </w:p>
     <w:p>
@@ -409,36 +1176,19 @@
         <w:jc w:val="both"/>
       </w:pPr>
       <w:r>
-        <w:t xml:space="preserve">Haskell permite definir tipos de datos con campos nombrados, similar a los </w:t>
-      </w:r>
-      <w:proofErr w:type="spellStart"/>
-      <w:r>
-        <w:t>structs</w:t>
-      </w:r>
-      <w:proofErr w:type="spellEnd"/>
-      <w:r>
-        <w:t xml:space="preserve"> de C o a las clases simples de Python y Java.</w:t>
+        <w:t>Haskell permite definir tipos de datos con campos nombrados, similar a los structs de C o a las clases simples de Python y Java.</w:t>
       </w:r>
     </w:p>
     <w:p>
       <w:pPr>
         <w:jc w:val="both"/>
       </w:pPr>
-      <w:proofErr w:type="spellStart"/>
       <w:r>
         <w:rPr>
           <w:b/>
           <w:bCs/>
         </w:rPr>
-        <w:t>Maps</w:t>
-      </w:r>
-      <w:proofErr w:type="spellEnd"/>
-      <w:r>
-        <w:rPr>
-          <w:b/>
-          <w:bCs/>
-        </w:rPr>
-        <w:t xml:space="preserve"> y Sets</w:t>
+        <w:t>Maps y Sets</w:t>
       </w:r>
     </w:p>
     <w:p>
@@ -446,39 +1196,7 @@
         <w:jc w:val="both"/>
       </w:pPr>
       <w:r>
-        <w:t xml:space="preserve">Haskell provee estructuras de datos eficientes en el módulo </w:t>
-      </w:r>
-      <w:proofErr w:type="spellStart"/>
-      <w:r>
-        <w:t>Data.Map</w:t>
-      </w:r>
-      <w:proofErr w:type="spellEnd"/>
-      <w:r>
-        <w:t xml:space="preserve"> (mapa clave-valor, equivalente a </w:t>
-      </w:r>
-      <w:proofErr w:type="spellStart"/>
-      <w:r>
-        <w:t>HashMap</w:t>
-      </w:r>
-      <w:proofErr w:type="spellEnd"/>
-      <w:r>
-        <w:t xml:space="preserve"> en Java o </w:t>
-      </w:r>
-      <w:proofErr w:type="spellStart"/>
-      <w:r>
-        <w:t>dict</w:t>
-      </w:r>
-      <w:proofErr w:type="spellEnd"/>
-      <w:r>
-        <w:t xml:space="preserve"> en Python) y </w:t>
-      </w:r>
-      <w:proofErr w:type="spellStart"/>
-      <w:r>
-        <w:t>Data.Set</w:t>
-      </w:r>
-      <w:proofErr w:type="spellEnd"/>
-      <w:r>
-        <w:t xml:space="preserve"> (conjunto de valores únicos ordenados).</w:t>
+        <w:t>Haskell provee estructuras de datos eficientes en el módulo Data.Map (mapa clave-valor, equivalente a HashMap en Java o dict en Python) y Data.Set (conjunto de valores únicos ordenados).</w:t>
       </w:r>
     </w:p>
     <w:p>
@@ -492,115 +1210,721 @@
         <w:rPr>
           <w:lang w:val="en-US"/>
         </w:rPr>
-        <w:t>(</w:t>
-      </w:r>
-      <w:r>
-        <w:rPr>
-          <w:lang w:val="en-US"/>
-        </w:rPr>
-        <w:t>Haskell Platform / GHC Base Libraries</w:t>
-      </w:r>
-      <w:r>
-        <w:rPr>
-          <w:lang w:val="en-US"/>
-        </w:rPr>
-        <w:t>)</w:t>
+        <w:t>(Haskell Platform / GHC Base Libraries)</w:t>
       </w:r>
     </w:p>
     <w:p>
       <w:pPr>
         <w:jc w:val="both"/>
-        <w:rPr>
-          <w:lang w:val="en-US"/>
-        </w:rPr>
       </w:pPr>
       <w:r>
         <w:rPr>
           <w:b/>
           <w:bCs/>
           <w:u w:val="single"/>
-          <w:lang w:val="en-US"/>
-        </w:rPr>
-        <w:t xml:space="preserve">Arrays e </w:t>
-      </w:r>
-      <w:proofErr w:type="spellStart"/>
+        </w:rPr>
+        <w:t>Arrays e IORef</w:t>
+      </w:r>
+    </w:p>
+    <w:p>
+      <w:pPr>
+        <w:jc w:val="both"/>
+      </w:pPr>
+      <w:r>
+        <w:t>Haskell es inmutable por defecto, pero provee mecanismos controlados para mutabilidad cuando se necesita: IORef (referencia mutable en IO), STRef (en el monad ST), y Array (arreglos inmutables eficientes). En Java y Python, los arreglos son mutables por defecto.</w:t>
+      </w:r>
+    </w:p>
+    <w:p>
+      <w:pPr>
+        <w:jc w:val="both"/>
+      </w:pPr>
+    </w:p>
+    <w:p>
+      <w:pPr>
+        <w:jc w:val="both"/>
+      </w:pPr>
       <w:r>
         <w:rPr>
           <w:b/>
           <w:bCs/>
           <w:u w:val="single"/>
-          <w:lang w:val="en-US"/>
-        </w:rPr>
-        <w:t>IORef</w:t>
-      </w:r>
-      <w:proofErr w:type="spellEnd"/>
-    </w:p>
+        </w:rPr>
+        <w:t>Tabla Comparativa General</w:t>
+      </w:r>
+    </w:p>
+    <w:tbl>
+      <w:tblPr>
+        <w:tblStyle w:val="TableGrid"/>
+        <w:tblW w:w="0" w:type="auto"/>
+        <w:tblLook w:val="04A0" w:firstRow="1" w:lastRow="0" w:firstColumn="1" w:lastColumn="0" w:noHBand="0" w:noVBand="1"/>
+      </w:tblPr>
+      <w:tblGrid>
+        <w:gridCol w:w="2316"/>
+        <w:gridCol w:w="2393"/>
+        <w:gridCol w:w="2311"/>
+        <w:gridCol w:w="2330"/>
+      </w:tblGrid>
+      <w:tr>
+        <w:tc>
+          <w:tcPr>
+            <w:tcW w:w="2337" w:type="dxa"/>
+          </w:tcPr>
+          <w:p>
+            <w:pPr>
+              <w:jc w:val="both"/>
+            </w:pPr>
+            <w:r>
+              <w:t>Aspecto</w:t>
+            </w:r>
+          </w:p>
+        </w:tc>
+        <w:tc>
+          <w:tcPr>
+            <w:tcW w:w="2337" w:type="dxa"/>
+          </w:tcPr>
+          <w:p>
+            <w:pPr>
+              <w:jc w:val="both"/>
+            </w:pPr>
+            <w:r>
+              <w:t>Haskell</w:t>
+            </w:r>
+          </w:p>
+        </w:tc>
+        <w:tc>
+          <w:tcPr>
+            <w:tcW w:w="2338" w:type="dxa"/>
+          </w:tcPr>
+          <w:p>
+            <w:pPr>
+              <w:jc w:val="both"/>
+            </w:pPr>
+            <w:r>
+              <w:t>Python</w:t>
+            </w:r>
+          </w:p>
+        </w:tc>
+        <w:tc>
+          <w:tcPr>
+            <w:tcW w:w="2338" w:type="dxa"/>
+          </w:tcPr>
+          <w:p>
+            <w:pPr>
+              <w:jc w:val="both"/>
+            </w:pPr>
+            <w:r>
+              <w:t>Java</w:t>
+            </w:r>
+          </w:p>
+        </w:tc>
+      </w:tr>
+      <w:tr>
+        <w:tc>
+          <w:tcPr>
+            <w:tcW w:w="2337" w:type="dxa"/>
+          </w:tcPr>
+          <w:p>
+            <w:pPr>
+              <w:jc w:val="both"/>
+            </w:pPr>
+            <w:r>
+              <w:t>Paradigma principal</w:t>
+            </w:r>
+          </w:p>
+        </w:tc>
+        <w:tc>
+          <w:tcPr>
+            <w:tcW w:w="2337" w:type="dxa"/>
+          </w:tcPr>
+          <w:p>
+            <w:pPr>
+              <w:jc w:val="both"/>
+            </w:pPr>
+            <w:r>
+              <w:t>Funcional puro</w:t>
+            </w:r>
+          </w:p>
+        </w:tc>
+        <w:tc>
+          <w:tcPr>
+            <w:tcW w:w="2338" w:type="dxa"/>
+          </w:tcPr>
+          <w:p>
+            <w:pPr>
+              <w:jc w:val="both"/>
+            </w:pPr>
+            <w:r>
+              <w:t>Multiparadigma</w:t>
+            </w:r>
+          </w:p>
+        </w:tc>
+        <w:tc>
+          <w:tcPr>
+            <w:tcW w:w="2338" w:type="dxa"/>
+          </w:tcPr>
+          <w:p>
+            <w:pPr>
+              <w:jc w:val="both"/>
+            </w:pPr>
+            <w:r>
+              <w:t>Orientado a objetos</w:t>
+            </w:r>
+          </w:p>
+        </w:tc>
+      </w:tr>
+      <w:tr>
+        <w:tc>
+          <w:tcPr>
+            <w:tcW w:w="2337" w:type="dxa"/>
+          </w:tcPr>
+          <w:p>
+            <w:pPr>
+              <w:jc w:val="both"/>
+            </w:pPr>
+            <w:r>
+              <w:t>Tipado</w:t>
+            </w:r>
+          </w:p>
+        </w:tc>
+        <w:tc>
+          <w:tcPr>
+            <w:tcW w:w="2337" w:type="dxa"/>
+          </w:tcPr>
+          <w:p>
+            <w:pPr>
+              <w:jc w:val="both"/>
+            </w:pPr>
+            <w:r>
+              <w:t>Estático + fuerte</w:t>
+            </w:r>
+          </w:p>
+        </w:tc>
+        <w:tc>
+          <w:tcPr>
+            <w:tcW w:w="2338" w:type="dxa"/>
+          </w:tcPr>
+          <w:p>
+            <w:pPr>
+              <w:jc w:val="both"/>
+            </w:pPr>
+            <w:r>
+              <w:t>Dinámico + fuerte</w:t>
+            </w:r>
+          </w:p>
+        </w:tc>
+        <w:tc>
+          <w:tcPr>
+            <w:tcW w:w="2338" w:type="dxa"/>
+          </w:tcPr>
+          <w:p>
+            <w:pPr>
+              <w:jc w:val="both"/>
+            </w:pPr>
+            <w:r>
+              <w:t>Estático + fuerte</w:t>
+            </w:r>
+          </w:p>
+        </w:tc>
+      </w:tr>
+      <w:tr>
+        <w:tc>
+          <w:tcPr>
+            <w:tcW w:w="2337" w:type="dxa"/>
+          </w:tcPr>
+          <w:p>
+            <w:pPr>
+              <w:jc w:val="both"/>
+            </w:pPr>
+            <w:r>
+              <w:t>Inferencia de tipos</w:t>
+            </w:r>
+          </w:p>
+        </w:tc>
+        <w:tc>
+          <w:tcPr>
+            <w:tcW w:w="2337" w:type="dxa"/>
+          </w:tcPr>
+          <w:p>
+            <w:pPr>
+              <w:jc w:val="both"/>
+            </w:pPr>
+            <w:r>
+              <w:t>Completa (HM)</w:t>
+            </w:r>
+          </w:p>
+        </w:tc>
+        <w:tc>
+          <w:tcPr>
+            <w:tcW w:w="2338" w:type="dxa"/>
+          </w:tcPr>
+          <w:p>
+            <w:pPr>
+              <w:jc w:val="both"/>
+            </w:pPr>
+            <w:r>
+              <w:t>No (type hints opt.)</w:t>
+            </w:r>
+          </w:p>
+        </w:tc>
+        <w:tc>
+          <w:tcPr>
+            <w:tcW w:w="2338" w:type="dxa"/>
+          </w:tcPr>
+          <w:p>
+            <w:pPr>
+              <w:jc w:val="both"/>
+            </w:pPr>
+            <w:r>
+              <w:t>Parcial (var, Java10+)</w:t>
+            </w:r>
+          </w:p>
+        </w:tc>
+      </w:tr>
+      <w:tr>
+        <w:tc>
+          <w:tcPr>
+            <w:tcW w:w="2337" w:type="dxa"/>
+          </w:tcPr>
+          <w:p>
+            <w:pPr>
+              <w:jc w:val="both"/>
+            </w:pPr>
+            <w:r>
+              <w:t>Inmutabilidad</w:t>
+            </w:r>
+          </w:p>
+        </w:tc>
+        <w:tc>
+          <w:tcPr>
+            <w:tcW w:w="2337" w:type="dxa"/>
+          </w:tcPr>
+          <w:p>
+            <w:pPr>
+              <w:jc w:val="both"/>
+            </w:pPr>
+            <w:r>
+              <w:t>Por defecto</w:t>
+            </w:r>
+          </w:p>
+        </w:tc>
+        <w:tc>
+          <w:tcPr>
+            <w:tcW w:w="2338" w:type="dxa"/>
+          </w:tcPr>
+          <w:p>
+            <w:pPr>
+              <w:jc w:val="both"/>
+            </w:pPr>
+            <w:r>
+              <w:t>Opcional</w:t>
+            </w:r>
+          </w:p>
+        </w:tc>
+        <w:tc>
+          <w:tcPr>
+            <w:tcW w:w="2338" w:type="dxa"/>
+          </w:tcPr>
+          <w:p>
+            <w:pPr>
+              <w:jc w:val="both"/>
+            </w:pPr>
+            <w:r>
+              <w:t>Opcional (final)</w:t>
+            </w:r>
+          </w:p>
+        </w:tc>
+      </w:tr>
+      <w:tr>
+        <w:tc>
+          <w:tcPr>
+            <w:tcW w:w="2337" w:type="dxa"/>
+          </w:tcPr>
+          <w:p>
+            <w:pPr>
+              <w:jc w:val="both"/>
+            </w:pPr>
+            <w:r>
+              <w:t>Evaluación</w:t>
+            </w:r>
+          </w:p>
+        </w:tc>
+        <w:tc>
+          <w:tcPr>
+            <w:tcW w:w="2337" w:type="dxa"/>
+          </w:tcPr>
+          <w:p>
+            <w:pPr>
+              <w:jc w:val="both"/>
+            </w:pPr>
+            <w:r>
+              <w:t>Perezosa (lazy)</w:t>
+            </w:r>
+          </w:p>
+        </w:tc>
+        <w:tc>
+          <w:tcPr>
+            <w:tcW w:w="2338" w:type="dxa"/>
+          </w:tcPr>
+          <w:p>
+            <w:pPr>
+              <w:jc w:val="both"/>
+            </w:pPr>
+            <w:r>
+              <w:t>Estricta (eager)</w:t>
+            </w:r>
+          </w:p>
+        </w:tc>
+        <w:tc>
+          <w:tcPr>
+            <w:tcW w:w="2338" w:type="dxa"/>
+          </w:tcPr>
+          <w:p>
+            <w:pPr>
+              <w:jc w:val="both"/>
+            </w:pPr>
+            <w:r>
+              <w:t>Estricta (eager)</w:t>
+            </w:r>
+          </w:p>
+        </w:tc>
+      </w:tr>
+      <w:tr>
+        <w:tc>
+          <w:tcPr>
+            <w:tcW w:w="2337" w:type="dxa"/>
+          </w:tcPr>
+          <w:p>
+            <w:pPr>
+              <w:jc w:val="both"/>
+            </w:pPr>
+            <w:r>
+              <w:t>Manejo de null</w:t>
+            </w:r>
+          </w:p>
+        </w:tc>
+        <w:tc>
+          <w:tcPr>
+            <w:tcW w:w="2337" w:type="dxa"/>
+          </w:tcPr>
+          <w:p>
+            <w:pPr>
+              <w:jc w:val="both"/>
+            </w:pPr>
+            <w:r>
+              <w:t>Maybe (seguro)</w:t>
+            </w:r>
+          </w:p>
+        </w:tc>
+        <w:tc>
+          <w:tcPr>
+            <w:tcW w:w="2338" w:type="dxa"/>
+          </w:tcPr>
+          <w:p>
+            <w:pPr>
+              <w:jc w:val="both"/>
+            </w:pPr>
+            <w:r>
+              <w:t>None (inseguro)</w:t>
+            </w:r>
+          </w:p>
+        </w:tc>
+        <w:tc>
+          <w:tcPr>
+            <w:tcW w:w="2338" w:type="dxa"/>
+          </w:tcPr>
+          <w:p>
+            <w:pPr>
+              <w:jc w:val="both"/>
+            </w:pPr>
+            <w:r>
+              <w:t>null/Optional</w:t>
+            </w:r>
+          </w:p>
+        </w:tc>
+      </w:tr>
+      <w:tr>
+        <w:tc>
+          <w:tcPr>
+            <w:tcW w:w="2337" w:type="dxa"/>
+          </w:tcPr>
+          <w:p>
+            <w:pPr>
+              <w:jc w:val="both"/>
+            </w:pPr>
+            <w:r>
+              <w:t>Estructuras mutables</w:t>
+            </w:r>
+          </w:p>
+        </w:tc>
+        <w:tc>
+          <w:tcPr>
+            <w:tcW w:w="2337" w:type="dxa"/>
+          </w:tcPr>
+          <w:p>
+            <w:pPr>
+              <w:jc w:val="both"/>
+            </w:pPr>
+            <w:r>
+              <w:t>IORef, STRef (expl.)</w:t>
+            </w:r>
+          </w:p>
+        </w:tc>
+        <w:tc>
+          <w:tcPr>
+            <w:tcW w:w="2338" w:type="dxa"/>
+          </w:tcPr>
+          <w:p>
+            <w:pPr>
+              <w:jc w:val="both"/>
+            </w:pPr>
+            <w:r>
+              <w:t>list, dict, etc.</w:t>
+            </w:r>
+          </w:p>
+        </w:tc>
+        <w:tc>
+          <w:tcPr>
+            <w:tcW w:w="2338" w:type="dxa"/>
+          </w:tcPr>
+          <w:p>
+            <w:pPr>
+              <w:jc w:val="both"/>
+            </w:pPr>
+            <w:r>
+              <w:t>ArrayList, HashMap</w:t>
+            </w:r>
+          </w:p>
+        </w:tc>
+      </w:tr>
+      <w:tr>
+        <w:tc>
+          <w:tcPr>
+            <w:tcW w:w="2337" w:type="dxa"/>
+          </w:tcPr>
+          <w:p>
+            <w:pPr>
+              <w:jc w:val="both"/>
+            </w:pPr>
+            <w:r>
+              <w:t>ADTs / Uniones</w:t>
+            </w:r>
+          </w:p>
+        </w:tc>
+        <w:tc>
+          <w:tcPr>
+            <w:tcW w:w="2337" w:type="dxa"/>
+          </w:tcPr>
+          <w:p>
+            <w:pPr>
+              <w:jc w:val="both"/>
+            </w:pPr>
+            <w:r>
+              <w:t>Nativo (data)</w:t>
+            </w:r>
+          </w:p>
+        </w:tc>
+        <w:tc>
+          <w:tcPr>
+            <w:tcW w:w="2338" w:type="dxa"/>
+          </w:tcPr>
+          <w:p>
+            <w:pPr>
+              <w:jc w:val="both"/>
+            </w:pPr>
+            <w:r>
+              <w:t>Emulado (clases)</w:t>
+            </w:r>
+          </w:p>
+        </w:tc>
+        <w:tc>
+          <w:tcPr>
+            <w:tcW w:w="2338" w:type="dxa"/>
+          </w:tcPr>
+          <w:p>
+            <w:pPr>
+              <w:jc w:val="both"/>
+            </w:pPr>
+            <w:r>
+              <w:t>sealed classes (J17+)</w:t>
+            </w:r>
+          </w:p>
+        </w:tc>
+      </w:tr>
+      <w:tr>
+        <w:tc>
+          <w:tcPr>
+            <w:tcW w:w="2337" w:type="dxa"/>
+          </w:tcPr>
+          <w:p>
+            <w:pPr>
+              <w:jc w:val="both"/>
+            </w:pPr>
+            <w:r>
+              <w:t>Map/Diccionario</w:t>
+            </w:r>
+          </w:p>
+        </w:tc>
+        <w:tc>
+          <w:tcPr>
+            <w:tcW w:w="2337" w:type="dxa"/>
+          </w:tcPr>
+          <w:p>
+            <w:pPr>
+              <w:jc w:val="both"/>
+            </w:pPr>
+            <w:r>
+              <w:t>Data.Map (árbol)</w:t>
+            </w:r>
+          </w:p>
+        </w:tc>
+        <w:tc>
+          <w:tcPr>
+            <w:tcW w:w="2338" w:type="dxa"/>
+          </w:tcPr>
+          <w:p>
+            <w:pPr>
+              <w:jc w:val="both"/>
+            </w:pPr>
+            <w:r>
+              <w:t>dict (hash)</w:t>
+            </w:r>
+          </w:p>
+        </w:tc>
+        <w:tc>
+          <w:tcPr>
+            <w:tcW w:w="2338" w:type="dxa"/>
+          </w:tcPr>
+          <w:p>
+            <w:pPr>
+              <w:jc w:val="both"/>
+            </w:pPr>
+            <w:r>
+              <w:t>HashMap/TreeMap</w:t>
+            </w:r>
+          </w:p>
+        </w:tc>
+      </w:tr>
+      <w:tr>
+        <w:tc>
+          <w:tcPr>
+            <w:tcW w:w="2337" w:type="dxa"/>
+          </w:tcPr>
+          <w:p>
+            <w:pPr>
+              <w:jc w:val="both"/>
+            </w:pPr>
+            <w:r>
+              <w:t>Curva de aprendizaje</w:t>
+            </w:r>
+          </w:p>
+        </w:tc>
+        <w:tc>
+          <w:tcPr>
+            <w:tcW w:w="2337" w:type="dxa"/>
+          </w:tcPr>
+          <w:p>
+            <w:pPr>
+              <w:jc w:val="both"/>
+            </w:pPr>
+            <w:r>
+              <w:t>Alta</w:t>
+            </w:r>
+          </w:p>
+        </w:tc>
+        <w:tc>
+          <w:tcPr>
+            <w:tcW w:w="2338" w:type="dxa"/>
+          </w:tcPr>
+          <w:p>
+            <w:pPr>
+              <w:jc w:val="both"/>
+            </w:pPr>
+            <w:r>
+              <w:t>Baja</w:t>
+            </w:r>
+          </w:p>
+        </w:tc>
+        <w:tc>
+          <w:tcPr>
+            <w:tcW w:w="2338" w:type="dxa"/>
+          </w:tcPr>
+          <w:p>
+            <w:pPr>
+              <w:jc w:val="both"/>
+            </w:pPr>
+            <w:r>
+              <w:t>Media</w:t>
+            </w:r>
+          </w:p>
+        </w:tc>
+      </w:tr>
+      <w:tr>
+        <w:tc>
+          <w:tcPr>
+            <w:tcW w:w="2337" w:type="dxa"/>
+          </w:tcPr>
+          <w:p>
+            <w:pPr>
+              <w:jc w:val="both"/>
+            </w:pPr>
+            <w:r>
+              <w:t>Uso en industria</w:t>
+            </w:r>
+          </w:p>
+        </w:tc>
+        <w:tc>
+          <w:tcPr>
+            <w:tcW w:w="2337" w:type="dxa"/>
+          </w:tcPr>
+          <w:p>
+            <w:pPr>
+              <w:jc w:val="both"/>
+            </w:pPr>
+            <w:r>
+              <w:t>Académico/Finanzas</w:t>
+            </w:r>
+          </w:p>
+        </w:tc>
+        <w:tc>
+          <w:tcPr>
+            <w:tcW w:w="2338" w:type="dxa"/>
+          </w:tcPr>
+          <w:p>
+            <w:pPr>
+              <w:jc w:val="both"/>
+            </w:pPr>
+            <w:r>
+              <w:t>Muy amplio</w:t>
+            </w:r>
+          </w:p>
+        </w:tc>
+        <w:tc>
+          <w:tcPr>
+            <w:tcW w:w="2338" w:type="dxa"/>
+          </w:tcPr>
+          <w:p>
+            <w:pPr>
+              <w:jc w:val="both"/>
+            </w:pPr>
+            <w:r>
+              <w:t>Muy amplio</w:t>
+            </w:r>
+          </w:p>
+        </w:tc>
+      </w:tr>
+    </w:tbl>
     <w:p>
       <w:pPr>
         <w:jc w:val="both"/>
       </w:pPr>
-      <w:r>
-        <w:t xml:space="preserve">Haskell es inmutable por defecto, pero provee mecanismos controlados para mutabilidad cuando se necesita: </w:t>
-      </w:r>
-      <w:proofErr w:type="spellStart"/>
-      <w:r>
-        <w:t>IORef</w:t>
-      </w:r>
-      <w:proofErr w:type="spellEnd"/>
-      <w:r>
-        <w:t xml:space="preserve"> (referencia mutable en IO), </w:t>
-      </w:r>
-      <w:proofErr w:type="spellStart"/>
-      <w:r>
-        <w:t>STRef</w:t>
-      </w:r>
-      <w:proofErr w:type="spellEnd"/>
-      <w:r>
-        <w:t xml:space="preserve"> (en el </w:t>
-      </w:r>
-      <w:proofErr w:type="spellStart"/>
-      <w:r>
-        <w:t>monad</w:t>
-      </w:r>
-      <w:proofErr w:type="spellEnd"/>
-      <w:r>
-        <w:t xml:space="preserve"> ST), y Array (arreglos inmutables eficientes). En Java y Python, los arreglos son mutables por defecto.</w:t>
-      </w:r>
-    </w:p>
-    <w:p>
-      <w:pPr>
-        <w:jc w:val="both"/>
-      </w:pPr>
-    </w:p>
-    <w:p>
-      <w:pPr>
-        <w:jc w:val="both"/>
-      </w:pPr>
-      <w:r>
+    </w:p>
+    <w:p>
+      <w:pPr>
         <w:rPr>
           <w:b/>
           <w:bCs/>
           <w:u w:val="single"/>
         </w:rPr>
-        <w:t>Tabla Comparativa General</w:t>
-      </w:r>
-    </w:p>
-    <w:p>
-      <w:pPr>
-        <w:jc w:val="both"/>
-      </w:pPr>
-      <w:r>
-        <w:t>As</w:t>
-      </w:r>
-    </w:p>
-    <w:p>
-      <w:pPr>
-        <w:jc w:val="both"/>
-      </w:pPr>
-    </w:p>
-    <w:p>
-      <w:pPr>
-        <w:jc w:val="both"/>
       </w:pPr>
       <w:r>
         <w:rPr>
@@ -608,77 +1932,91 @@
           <w:bCs/>
           <w:u w:val="single"/>
         </w:rPr>
+        <w:br w:type="page"/>
+      </w:r>
+    </w:p>
+    <w:p>
+      <w:pPr>
+        <w:jc w:val="both"/>
+      </w:pPr>
+      <w:r>
+        <w:rPr>
+          <w:b/>
+          <w:bCs/>
+          <w:u w:val="single"/>
+        </w:rPr>
         <w:lastRenderedPageBreak/>
         <w:t>Referencias</w:t>
       </w:r>
     </w:p>
     <w:p>
       <w:pPr>
+        <w:ind w:left="709" w:hanging="709"/>
         <w:jc w:val="both"/>
+      </w:pPr>
+      <w:r>
         <w:rPr>
           <w:lang w:val="en-US"/>
         </w:rPr>
-      </w:pPr>
-      <w:r>
+        <w:t xml:space="preserve">GHC Team. (2024). GHC User's Guide. Glasgow Haskell Compiler. </w:t>
+      </w:r>
+      <w:hyperlink r:id="rId6" w:history="1">
+        <w:r>
+          <w:rPr>
+            <w:rStyle w:val="Hyperlink"/>
+          </w:rPr>
+          <w:t>https://downloads.haskell.org/ghc/latest/docs/users_guide/</w:t>
+        </w:r>
+      </w:hyperlink>
+    </w:p>
+    <w:p>
+      <w:pPr>
+        <w:ind w:left="709" w:hanging="709"/>
+        <w:jc w:val="both"/>
         <w:rPr>
           <w:lang w:val="en-US"/>
         </w:rPr>
-        <w:t>Pierce, B. C. (2002). Types and Programming Languages. MIT Press. ISBN 978-0-262-16209-8.</w:t>
-      </w:r>
-    </w:p>
-    <w:p>
-      <w:pPr>
+      </w:pPr>
+      <w:r>
+        <w:rPr>
+          <w:lang w:val="en-US"/>
+        </w:rPr>
+        <w:t xml:space="preserve">Lipovaca, M. (2011). Learn You a Haskell for Great Good! No Starch Press. Disponible en: </w:t>
+      </w:r>
+      <w:hyperlink r:id="rId7" w:history="1">
+        <w:r>
+          <w:rPr>
+            <w:rStyle w:val="Hyperlink"/>
+            <w:lang w:val="en-US"/>
+          </w:rPr>
+          <w:t>http://learnyouahaskell.com</w:t>
+        </w:r>
+      </w:hyperlink>
+    </w:p>
+    <w:p>
+      <w:pPr>
+        <w:ind w:left="709" w:hanging="709"/>
         <w:jc w:val="both"/>
-      </w:pPr>
-      <w:r>
         <w:rPr>
           <w:lang w:val="en-US"/>
         </w:rPr>
+      </w:pPr>
+      <w:r>
+        <w:rPr>
+          <w:lang w:val="en-US"/>
+        </w:rPr>
         <w:t xml:space="preserve">Milner, R. (1978). A theory of type polymorphism in programming. </w:t>
       </w:r>
-      <w:proofErr w:type="spellStart"/>
-      <w:r>
-        <w:t>Journal</w:t>
-      </w:r>
-      <w:proofErr w:type="spellEnd"/>
-      <w:r>
-        <w:t xml:space="preserve"> </w:t>
-      </w:r>
-      <w:proofErr w:type="spellStart"/>
-      <w:r>
-        <w:t>of</w:t>
-      </w:r>
-      <w:proofErr w:type="spellEnd"/>
-      <w:r>
-        <w:t xml:space="preserve"> </w:t>
-      </w:r>
-      <w:proofErr w:type="spellStart"/>
-      <w:r>
-        <w:t>Computer</w:t>
-      </w:r>
-      <w:proofErr w:type="spellEnd"/>
-      <w:r>
-        <w:t xml:space="preserve"> and </w:t>
-      </w:r>
-      <w:proofErr w:type="spellStart"/>
-      <w:r>
-        <w:t>System</w:t>
-      </w:r>
-      <w:proofErr w:type="spellEnd"/>
-      <w:r>
-        <w:t xml:space="preserve"> </w:t>
-      </w:r>
-      <w:proofErr w:type="spellStart"/>
-      <w:r>
-        <w:t>Sciences</w:t>
-      </w:r>
-      <w:proofErr w:type="spellEnd"/>
-      <w:r>
-        <w:t>, 17(3), 348-375.</w:t>
-      </w:r>
-    </w:p>
-    <w:p>
-      <w:pPr>
+      <w:r>
+        <w:rPr>
+          <w:lang w:val="en-US"/>
+        </w:rPr>
+        <w:t>Journal of Computer and System Sciences, 17(3), 348-375.</w:t>
+      </w:r>
+    </w:p>
+    <w:p>
+      <w:pPr>
+        <w:ind w:left="709" w:hanging="709"/>
         <w:jc w:val="both"/>
         <w:rPr>
           <w:lang w:val="en-US"/>
@@ -688,23 +2026,9 @@
         <w:rPr>
           <w:lang w:val="en-US"/>
         </w:rPr>
-        <w:t xml:space="preserve">O'Sullivan, B., Stewart, D., &amp; Goerzen, J. (2008). Real World Haskell. O'Reilly Media. Disponible </w:t>
-      </w:r>
-      <w:proofErr w:type="spellStart"/>
-      <w:r>
-        <w:rPr>
-          <w:lang w:val="en-US"/>
-        </w:rPr>
-        <w:t>en</w:t>
-      </w:r>
-      <w:proofErr w:type="spellEnd"/>
-      <w:r>
-        <w:rPr>
-          <w:lang w:val="en-US"/>
-        </w:rPr>
-        <w:t xml:space="preserve">: </w:t>
-      </w:r>
-      <w:hyperlink r:id="rId4" w:history="1">
+        <w:t xml:space="preserve">O'Sullivan, B., Stewart, D., &amp; Goerzen, J. (2008). Real World Haskell. O'Reilly Media. Disponible en: </w:t>
+      </w:r>
+      <w:hyperlink r:id="rId8" w:history="1">
         <w:r>
           <w:rPr>
             <w:rStyle w:val="Hyperlink"/>
@@ -716,41 +2040,42 @@
     </w:p>
     <w:p>
       <w:pPr>
+        <w:ind w:left="709" w:hanging="709"/>
         <w:jc w:val="both"/>
-      </w:pPr>
-      <w:r>
         <w:rPr>
           <w:lang w:val="en-US"/>
         </w:rPr>
-        <w:t xml:space="preserve">GHC Team. (2024). GHC User's Guide. Glasgow Haskell Compiler. </w:t>
-      </w:r>
-      <w:hyperlink r:id="rId5" w:history="1">
-        <w:r>
-          <w:rPr>
-            <w:rStyle w:val="Hyperlink"/>
-          </w:rPr>
-          <w:t>https://downloads.haskell.org/ghc/latest/docs/users_guide/</w:t>
-        </w:r>
-      </w:hyperlink>
-    </w:p>
-    <w:p>
-      <w:pPr>
+      </w:pPr>
+      <w:r>
+        <w:t xml:space="preserve">Peyton Jones, S. (Ed.). </w:t>
+      </w:r>
+      <w:r>
+        <w:rPr>
+          <w:lang w:val="en-US"/>
+        </w:rPr>
+        <w:t>(2003). Haskell 98 Language and Libraries: The Revised Report. Cambridge University Press.</w:t>
+      </w:r>
+    </w:p>
+    <w:p>
+      <w:pPr>
+        <w:ind w:left="709" w:hanging="709"/>
         <w:jc w:val="both"/>
         <w:rPr>
           <w:lang w:val="en-US"/>
         </w:rPr>
       </w:pPr>
       <w:r>
-        <w:t xml:space="preserve">Peyton Jones, S. (Ed.). </w:t>
+        <w:t xml:space="preserve">Pierce, B. C. (2002). </w:t>
       </w:r>
       <w:r>
         <w:rPr>
           <w:lang w:val="en-US"/>
         </w:rPr>
-        <w:t>(2003). Haskell 98 Language and Libraries: The Revised Report. Cambridge University Press.</w:t>
+        <w:t>Types and Programming Languages. MIT Press. ISBN 978-0-262-16209-8.</w:t>
       </w:r>
     </w:p>
     <w:sectPr>
+      <w:footerReference w:type="default" r:id="rId9"/>
       <w:pgSz w:w="12240" w:h="15840"/>
       <w:pgMar w:top="1440" w:right="1440" w:bottom="1440" w:left="1440" w:header="708" w:footer="708" w:gutter="0"/>
       <w:cols w:space="708"/>
@@ -758,6 +2083,109 @@
     </w:sectPr>
   </w:body>
 </w:document>
+</file>
+
+<file path=word/endnotes.xml><?xml version="1.0" encoding="utf-8"?>
+<w:endnotes xmlns:wpc="http://schemas.microsoft.com/office/word/2010/wordprocessingCanvas" xmlns:cx="http://schemas.microsoft.com/office/drawing/2014/chartex" xmlns:cx1="http://schemas.microsoft.com/office/drawing/2015/9/8/chartex" xmlns:cx2="http://schemas.microsoft.com/office/drawing/2015/10/21/chartex" xmlns:cx3="http://schemas.microsoft.com/office/drawing/2016/5/9/chartex" xmlns:cx4="http://schemas.microsoft.com/office/drawing/2016/5/10/chartex" xmlns:cx5="http://schemas.microsoft.com/office/drawing/2016/5/11/chartex" xmlns:cx6="http://schemas.microsoft.com/office/drawing/2016/5/12/chartex" xmlns:cx7="http://schemas.microsoft.com/office/drawing/2016/5/13/chartex" xmlns:cx8="http://schemas.microsoft.com/office/drawing/2016/5/14/chartex" xmlns:mc="http://schemas.openxmlformats.org/markup-compatibility/2006" xmlns:aink="http://schemas.microsoft.com/office/drawing/2016/ink" xmlns:am3d="http://schemas.microsoft.com/office/drawing/2017/model3d" xmlns:o="urn:schemas-microsoft-com:office:office" xmlns:oel="http://schemas.microsoft.com/office/2019/extlst" xmlns:r="http://schemas.openxmlformats.org/officeDocument/2006/relationships" xmlns:m="http://schemas.openxmlformats.org/officeDocument/2006/math" xmlns:v="urn:schemas-microsoft-com:vml" xmlns:wp14="http://schemas.microsoft.com/office/word/2010/wordprocessingDrawing" xmlns:wp="http://schemas.openxmlformats.org/drawingml/2006/wordprocessingDrawing" xmlns:w10="urn:schemas-microsoft-com:office:word" xmlns:w="http://schemas.openxmlformats.org/wordprocessingml/2006/main" xmlns:w14="http://schemas.microsoft.com/office/word/2010/wordml" xmlns:w15="http://schemas.microsoft.com/office/word/2012/wordml" xmlns:w16cex="http://schemas.microsoft.com/office/word/2018/wordml/cex" xmlns:w16cid="http://schemas.microsoft.com/office/word/2016/wordml/cid" xmlns:w16="http://schemas.microsoft.com/office/word/2018/wordml" xmlns:w16du="http://schemas.microsoft.com/office/word/2023/wordml/word16du" xmlns:w16sdtdh="http://schemas.microsoft.com/office/word/2020/wordml/sdtdatahash" xmlns:w16sdtfl="http://schemas.microsoft.com/office/word/2024/wordml/sdtformatlock" xmlns:w16se="http://schemas.microsoft.com/office/word/2015/wordml/symex" xmlns:wpg="http://schemas.microsoft.com/office/word/2010/wordprocessingGroup" xmlns:wpi="http://schemas.microsoft.com/office/word/2010/wordprocessingInk" xmlns:wne="http://schemas.microsoft.com/office/word/2006/wordml" xmlns:wps="http://schemas.microsoft.com/office/word/2010/wordprocessingShape" mc:Ignorable="w14 w15 w16se w16cid w16 w16cex w16sdtdh w16sdtfl w16du wp14">
+  <w:endnote w:type="separator" w:id="-1">
+    <w:p>
+      <w:pPr>
+        <w:spacing w:after="0" w:line="240" w:lineRule="auto"/>
+      </w:pPr>
+      <w:r>
+        <w:separator/>
+      </w:r>
+    </w:p>
+  </w:endnote>
+  <w:endnote w:type="continuationSeparator" w:id="0">
+    <w:p>
+      <w:pPr>
+        <w:spacing w:after="0" w:line="240" w:lineRule="auto"/>
+      </w:pPr>
+      <w:r>
+        <w:continuationSeparator/>
+      </w:r>
+    </w:p>
+  </w:endnote>
+</w:endnotes>
+</file>
+
+<file path=word/footer1.xml><?xml version="1.0" encoding="utf-8"?>
+<w:ftr xmlns:wpc="http://schemas.microsoft.com/office/word/2010/wordprocessingCanvas" xmlns:cx="http://schemas.microsoft.com/office/drawing/2014/chartex" xmlns:cx1="http://schemas.microsoft.com/office/drawing/2015/9/8/chartex" xmlns:cx2="http://schemas.microsoft.com/office/drawing/2015/10/21/chartex" xmlns:cx3="http://schemas.microsoft.com/office/drawing/2016/5/9/chartex" xmlns:cx4="http://schemas.microsoft.com/office/drawing/2016/5/10/chartex" xmlns:cx5="http://schemas.microsoft.com/office/drawing/2016/5/11/chartex" xmlns:cx6="http://schemas.microsoft.com/office/drawing/2016/5/12/chartex" xmlns:cx7="http://schemas.microsoft.com/office/drawing/2016/5/13/chartex" xmlns:cx8="http://schemas.microsoft.com/office/drawing/2016/5/14/chartex" xmlns:mc="http://schemas.openxmlformats.org/markup-compatibility/2006" xmlns:aink="http://schemas.microsoft.com/office/drawing/2016/ink" xmlns:am3d="http://schemas.microsoft.com/office/drawing/2017/model3d" xmlns:o="urn:schemas-microsoft-com:office:office" xmlns:oel="http://schemas.microsoft.com/office/2019/extlst" xmlns:r="http://schemas.openxmlformats.org/officeDocument/2006/relationships" xmlns:m="http://schemas.openxmlformats.org/officeDocument/2006/math" xmlns:v="urn:schemas-microsoft-com:vml" xmlns:wp14="http://schemas.microsoft.com/office/word/2010/wordprocessingDrawing" xmlns:wp="http://schemas.openxmlformats.org/drawingml/2006/wordprocessingDrawing" xmlns:w10="urn:schemas-microsoft-com:office:word" xmlns:w="http://schemas.openxmlformats.org/wordprocessingml/2006/main" xmlns:w14="http://schemas.microsoft.com/office/word/2010/wordml" xmlns:w15="http://schemas.microsoft.com/office/word/2012/wordml" xmlns:w16cex="http://schemas.microsoft.com/office/word/2018/wordml/cex" xmlns:w16cid="http://schemas.microsoft.com/office/word/2016/wordml/cid" xmlns:w16="http://schemas.microsoft.com/office/word/2018/wordml" xmlns:w16du="http://schemas.microsoft.com/office/word/2023/wordml/word16du" xmlns:w16sdtdh="http://schemas.microsoft.com/office/word/2020/wordml/sdtdatahash" xmlns:w16sdtfl="http://schemas.microsoft.com/office/word/2024/wordml/sdtformatlock" xmlns:w16se="http://schemas.microsoft.com/office/word/2015/wordml/symex" xmlns:wpg="http://schemas.microsoft.com/office/word/2010/wordprocessingGroup" xmlns:wpi="http://schemas.microsoft.com/office/word/2010/wordprocessingInk" xmlns:wne="http://schemas.microsoft.com/office/word/2006/wordml" xmlns:wps="http://schemas.microsoft.com/office/word/2010/wordprocessingShape" mc:Ignorable="w14 w15 w16se w16cid w16 w16cex w16sdtdh w16sdtfl w16du wp14">
+  <w:sdt>
+    <w:sdtPr>
+      <w:id w:val="1005865434"/>
+      <w:docPartObj>
+        <w:docPartGallery w:val="Page Numbers (Bottom of Page)"/>
+        <w:docPartUnique/>
+      </w:docPartObj>
+    </w:sdtPr>
+    <w:sdtEndPr>
+      <w:rPr>
+        <w:noProof/>
+      </w:rPr>
+    </w:sdtEndPr>
+    <w:sdtContent>
+      <w:p>
+        <w:pPr>
+          <w:pStyle w:val="Footer"/>
+          <w:jc w:val="right"/>
+        </w:pPr>
+        <w:r>
+          <w:fldChar w:fldCharType="begin"/>
+        </w:r>
+        <w:r>
+          <w:instrText xml:space="preserve"> PAGE   \* MERGEFORMAT </w:instrText>
+        </w:r>
+        <w:r>
+          <w:fldChar w:fldCharType="separate"/>
+        </w:r>
+        <w:r>
+          <w:rPr>
+            <w:noProof/>
+          </w:rPr>
+          <w:t>2</w:t>
+        </w:r>
+        <w:r>
+          <w:rPr>
+            <w:noProof/>
+          </w:rPr>
+          <w:fldChar w:fldCharType="end"/>
+        </w:r>
+      </w:p>
+    </w:sdtContent>
+  </w:sdt>
+  <w:p>
+    <w:pPr>
+      <w:pStyle w:val="Footer"/>
+    </w:pPr>
+  </w:p>
+</w:ftr>
+</file>
+
+<file path=word/footnotes.xml><?xml version="1.0" encoding="utf-8"?>
+<w:footnotes xmlns:wpc="http://schemas.microsoft.com/office/word/2010/wordprocessingCanvas" xmlns:cx="http://schemas.microsoft.com/office/drawing/2014/chartex" xmlns:cx1="http://schemas.microsoft.com/office/drawing/2015/9/8/chartex" xmlns:cx2="http://schemas.microsoft.com/office/drawing/2015/10/21/chartex" xmlns:cx3="http://schemas.microsoft.com/office/drawing/2016/5/9/chartex" xmlns:cx4="http://schemas.microsoft.com/office/drawing/2016/5/10/chartex" xmlns:cx5="http://schemas.microsoft.com/office/drawing/2016/5/11/chartex" xmlns:cx6="http://schemas.microsoft.com/office/drawing/2016/5/12/chartex" xmlns:cx7="http://schemas.microsoft.com/office/drawing/2016/5/13/chartex" xmlns:cx8="http://schemas.microsoft.com/office/drawing/2016/5/14/chartex" xmlns:mc="http://schemas.openxmlformats.org/markup-compatibility/2006" xmlns:aink="http://schemas.microsoft.com/office/drawing/2016/ink" xmlns:am3d="http://schemas.microsoft.com/office/drawing/2017/model3d" xmlns:o="urn:schemas-microsoft-com:office:office" xmlns:oel="http://schemas.microsoft.com/office/2019/extlst" xmlns:r="http://schemas.openxmlformats.org/officeDocument/2006/relationships" xmlns:m="http://schemas.openxmlformats.org/officeDocument/2006/math" xmlns:v="urn:schemas-microsoft-com:vml" xmlns:wp14="http://schemas.microsoft.com/office/word/2010/wordprocessingDrawing" xmlns:wp="http://schemas.openxmlformats.org/drawingml/2006/wordprocessingDrawing" xmlns:w10="urn:schemas-microsoft-com:office:word" xmlns:w="http://schemas.openxmlformats.org/wordprocessingml/2006/main" xmlns:w14="http://schemas.microsoft.com/office/word/2010/wordml" xmlns:w15="http://schemas.microsoft.com/office/word/2012/wordml" xmlns:w16cex="http://schemas.microsoft.com/office/word/2018/wordml/cex" xmlns:w16cid="http://schemas.microsoft.com/office/word/2016/wordml/cid" xmlns:w16="http://schemas.microsoft.com/office/word/2018/wordml" xmlns:w16du="http://schemas.microsoft.com/office/word/2023/wordml/word16du" xmlns:w16sdtdh="http://schemas.microsoft.com/office/word/2020/wordml/sdtdatahash" xmlns:w16sdtfl="http://schemas.microsoft.com/office/word/2024/wordml/sdtformatlock" xmlns:w16se="http://schemas.microsoft.com/office/word/2015/wordml/symex" xmlns:wpg="http://schemas.microsoft.com/office/word/2010/wordprocessingGroup" xmlns:wpi="http://schemas.microsoft.com/office/word/2010/wordprocessingInk" xmlns:wne="http://schemas.microsoft.com/office/word/2006/wordml" xmlns:wps="http://schemas.microsoft.com/office/word/2010/wordprocessingShape" mc:Ignorable="w14 w15 w16se w16cid w16 w16cex w16sdtdh w16sdtfl w16du wp14">
+  <w:footnote w:type="separator" w:id="-1">
+    <w:p>
+      <w:pPr>
+        <w:spacing w:after="0" w:line="240" w:lineRule="auto"/>
+      </w:pPr>
+      <w:r>
+        <w:separator/>
+      </w:r>
+    </w:p>
+  </w:footnote>
+  <w:footnote w:type="continuationSeparator" w:id="0">
+    <w:p>
+      <w:pPr>
+        <w:spacing w:after="0" w:line="240" w:lineRule="auto"/>
+      </w:pPr>
+      <w:r>
+        <w:continuationSeparator/>
+      </w:r>
+    </w:p>
+  </w:footnote>
+</w:footnotes>
 </file>
 
 <file path=word/styles.xml><?xml version="1.0" encoding="utf-8"?>
@@ -1363,6 +2791,7 @@
   <w:style w:type="character" w:default="1" w:styleId="DefaultParagraphFont">
     <w:name w:val="Default Paragraph Font"/>
     <w:uiPriority w:val="1"/>
+    <w:semiHidden/>
     <w:unhideWhenUsed/>
   </w:style>
   <w:style w:type="table" w:default="1" w:styleId="TableNormal">
@@ -1698,6 +3127,69 @@
       <w:color w:val="605E5C"/>
       <w:shd w:val="clear" w:color="auto" w:fill="E1DFDD"/>
     </w:rPr>
+  </w:style>
+  <w:style w:type="table" w:styleId="TableGrid">
+    <w:name w:val="Table Grid"/>
+    <w:basedOn w:val="TableNormal"/>
+    <w:uiPriority w:val="39"/>
+    <w:rsid w:val="004846A2"/>
+    <w:pPr>
+      <w:spacing w:after="0" w:line="240" w:lineRule="auto"/>
+    </w:pPr>
+    <w:tblPr>
+      <w:tblBorders>
+        <w:top w:val="single" w:sz="4" w:space="0" w:color="auto"/>
+        <w:left w:val="single" w:sz="4" w:space="0" w:color="auto"/>
+        <w:bottom w:val="single" w:sz="4" w:space="0" w:color="auto"/>
+        <w:right w:val="single" w:sz="4" w:space="0" w:color="auto"/>
+        <w:insideH w:val="single" w:sz="4" w:space="0" w:color="auto"/>
+        <w:insideV w:val="single" w:sz="4" w:space="0" w:color="auto"/>
+      </w:tblBorders>
+    </w:tblPr>
+  </w:style>
+  <w:style w:type="paragraph" w:styleId="Header">
+    <w:name w:val="header"/>
+    <w:basedOn w:val="Normal"/>
+    <w:link w:val="HeaderChar"/>
+    <w:uiPriority w:val="99"/>
+    <w:unhideWhenUsed/>
+    <w:rsid w:val="00D517A9"/>
+    <w:pPr>
+      <w:tabs>
+        <w:tab w:val="center" w:pos="4680"/>
+        <w:tab w:val="right" w:pos="9360"/>
+      </w:tabs>
+      <w:spacing w:after="0" w:line="240" w:lineRule="auto"/>
+    </w:pPr>
+  </w:style>
+  <w:style w:type="character" w:customStyle="1" w:styleId="HeaderChar">
+    <w:name w:val="Header Char"/>
+    <w:basedOn w:val="DefaultParagraphFont"/>
+    <w:link w:val="Header"/>
+    <w:uiPriority w:val="99"/>
+    <w:rsid w:val="00D517A9"/>
+  </w:style>
+  <w:style w:type="paragraph" w:styleId="Footer">
+    <w:name w:val="footer"/>
+    <w:basedOn w:val="Normal"/>
+    <w:link w:val="FooterChar"/>
+    <w:uiPriority w:val="99"/>
+    <w:unhideWhenUsed/>
+    <w:rsid w:val="00D517A9"/>
+    <w:pPr>
+      <w:tabs>
+        <w:tab w:val="center" w:pos="4680"/>
+        <w:tab w:val="right" w:pos="9360"/>
+      </w:tabs>
+      <w:spacing w:after="0" w:line="240" w:lineRule="auto"/>
+    </w:pPr>
+  </w:style>
+  <w:style w:type="character" w:customStyle="1" w:styleId="FooterChar">
+    <w:name w:val="Footer Char"/>
+    <w:basedOn w:val="DefaultParagraphFont"/>
+    <w:link w:val="Footer"/>
+    <w:uiPriority w:val="99"/>
+    <w:rsid w:val="00D517A9"/>
   </w:style>
 </w:styles>
 </file>

</xml_diff>